<commit_message>
- pages voitures 2 - formulaires d'authentification 2
</commit_message>
<xml_diff>
--- a/documents-resources/programme_suivant.docx
+++ b/documents-resources/programme_suivant.docx
@@ -374,98 +374,29 @@
           <w:szCs w:val="24"/>
           <w:lang w:val="fr-MA"/>
         </w:rPr>
-        <w:t>Réunion Dimanche à 18 : 00 :</w:t>
-      </w:r>
-    </w:p>
-    <w:p>
-      <w:pPr>
-        <w:pStyle w:val="Paragraphedeliste"/>
-        <w:numPr>
-          <w:ilvl w:val="0"/>
-          <w:numId w:val="2"/>
-        </w:numPr>
-        <w:rPr>
-          <w:lang w:val="fr-MA"/>
-        </w:rPr>
-      </w:pPr>
-      <w:r>
-        <w:rPr>
-          <w:lang w:val="fr-MA"/>
-        </w:rPr>
-        <w:t xml:space="preserve">Lier les données des voitures reçu à la page des voitures : </w:t>
-      </w:r>
-      <w:r>
-        <w:rPr>
-          <w:color w:val="FF0000"/>
-          <w:lang w:val="fr-MA"/>
-        </w:rPr>
-        <w:t>Hamza</w:t>
-      </w:r>
-    </w:p>
-    <w:p>
-      <w:pPr>
-        <w:pStyle w:val="Paragraphedeliste"/>
-        <w:numPr>
-          <w:ilvl w:val="0"/>
-          <w:numId w:val="2"/>
-        </w:numPr>
-        <w:rPr>
-          <w:lang w:val="fr-MA"/>
-        </w:rPr>
-      </w:pPr>
-      <w:r>
-        <w:rPr>
-          <w:lang w:val="fr-MA"/>
-        </w:rPr>
-        <w:t>Ajouter le fonctionnement aux formulaires de connexion (Insciption et Connexion ) et redirection vers l’espace client ou admin selon le role.</w:t>
-      </w:r>
-    </w:p>
-    <w:p>
-      <w:pPr>
-        <w:pStyle w:val="Paragraphedeliste"/>
-        <w:numPr>
-          <w:ilvl w:val="0"/>
-          <w:numId w:val="2"/>
-        </w:numPr>
-        <w:rPr>
-          <w:lang w:val="fr-MA"/>
-        </w:rPr>
-      </w:pPr>
-      <w:r>
-        <w:rPr>
-          <w:lang w:val="fr-MA"/>
-        </w:rPr>
-        <w:t>Création des dossiers admin et client et leur fichiers</w:t>
-      </w:r>
-    </w:p>
-    <w:p>
-      <w:pPr>
-        <w:pStyle w:val="Paragraphedeliste"/>
-        <w:rPr>
-          <w:lang w:val="fr-MA"/>
-        </w:rPr>
-      </w:pPr>
-    </w:p>
-    <w:p>
-      <w:pPr>
-        <w:pStyle w:val="Paragraphedeliste"/>
-        <w:numPr>
-          <w:ilvl w:val="0"/>
-          <w:numId w:val="1"/>
-        </w:numPr>
+        <w:t xml:space="preserve">Réunion </w:t>
+      </w:r>
+      <w:r>
         <w:rPr>
           <w:b/>
           <w:bCs/>
-          <w:lang w:val="fr-MA"/>
-        </w:rPr>
-      </w:pPr>
+          <w:color w:val="00B050"/>
+          <w:sz w:val="28"/>
+          <w:szCs w:val="24"/>
+          <w:lang w:val="fr-MA"/>
+        </w:rPr>
+        <w:t>Jeudi</w:t>
+      </w:r>
       <w:r>
         <w:rPr>
           <w:b/>
           <w:bCs/>
-          <w:lang w:val="fr-MA"/>
-        </w:rPr>
-        <w:t>Espace Admin :</w:t>
+          <w:color w:val="00B050"/>
+          <w:sz w:val="28"/>
+          <w:szCs w:val="24"/>
+          <w:lang w:val="fr-MA"/>
+        </w:rPr>
+        <w:t xml:space="preserve"> à 18 : 00 :</w:t>
       </w:r>
     </w:p>
     <w:p>
@@ -483,7 +414,14 @@
         <w:rPr>
           <w:lang w:val="fr-MA"/>
         </w:rPr>
-        <w:t>Navbar</w:t>
+        <w:t xml:space="preserve">Lier les données des voitures reçu à la page des voitures : </w:t>
+      </w:r>
+      <w:r>
+        <w:rPr>
+          <w:color w:val="FF0000"/>
+          <w:lang w:val="fr-MA"/>
+        </w:rPr>
+        <w:t>Hamza</w:t>
       </w:r>
     </w:p>
     <w:p>
@@ -501,8 +439,10 @@
         <w:rPr>
           <w:lang w:val="fr-MA"/>
         </w:rPr>
-        <w:t>Dashboard</w:t>
-      </w:r>
+        <w:t>Ajouter le fonctionnement aux formulaires de connexion (Insciption et Connexion ) et redirection vers l’espace client ou admin selon le role.</w:t>
+      </w:r>
+      <w:bookmarkStart w:id="0" w:name="_GoBack"/>
+      <w:bookmarkEnd w:id="0"/>
     </w:p>
     <w:p>
       <w:pPr>
@@ -519,80 +459,16 @@
         <w:rPr>
           <w:lang w:val="fr-MA"/>
         </w:rPr>
-        <w:t>Pages voitures :</w:t>
-      </w:r>
-    </w:p>
-    <w:p>
-      <w:pPr>
-        <w:pStyle w:val="Paragraphedeliste"/>
-        <w:numPr>
-          <w:ilvl w:val="0"/>
-          <w:numId w:val="3"/>
-        </w:numPr>
-        <w:rPr>
-          <w:lang w:val="fr-MA"/>
-        </w:rPr>
-      </w:pPr>
-      <w:r>
-        <w:rPr>
-          <w:lang w:val="fr-MA"/>
-        </w:rPr>
-        <w:t>Button et formulaire pour ajouter une voiture</w:t>
-      </w:r>
-    </w:p>
-    <w:p>
-      <w:pPr>
-        <w:pStyle w:val="Paragraphedeliste"/>
-        <w:numPr>
-          <w:ilvl w:val="0"/>
-          <w:numId w:val="3"/>
-        </w:numPr>
-        <w:rPr>
-          <w:lang w:val="fr-MA"/>
-        </w:rPr>
-      </w:pPr>
-      <w:r>
-        <w:rPr>
-          <w:lang w:val="fr-MA"/>
-        </w:rPr>
-        <w:t>Cards des voitures avec buttons : voir details, modifier,supprimer</w:t>
-      </w:r>
-    </w:p>
-    <w:p>
-      <w:pPr>
-        <w:pStyle w:val="Paragraphedeliste"/>
-        <w:numPr>
-          <w:ilvl w:val="0"/>
-          <w:numId w:val="2"/>
-        </w:numPr>
-        <w:rPr>
-          <w:lang w:val="fr-MA"/>
-        </w:rPr>
-      </w:pPr>
-      <w:r>
-        <w:rPr>
-          <w:lang w:val="fr-MA"/>
-        </w:rPr>
-        <w:t>Pages des demandes :</w:t>
-      </w:r>
-    </w:p>
-    <w:p>
-      <w:pPr>
-        <w:pStyle w:val="Paragraphedeliste"/>
-        <w:numPr>
-          <w:ilvl w:val="0"/>
-          <w:numId w:val="4"/>
-        </w:numPr>
-        <w:rPr>
-          <w:lang w:val="fr-MA"/>
-        </w:rPr>
-      </w:pPr>
-      <w:r>
-        <w:rPr>
-          <w:lang w:val="fr-MA"/>
-        </w:rPr>
-        <w:t>Afficher tous les demandes des clients avec buttons : voir details, accepter,refuser</w:t>
-      </w:r>
+        <w:t>Création des dossiers admin et client et leur fichiers</w:t>
+      </w:r>
+    </w:p>
+    <w:p>
+      <w:pPr>
+        <w:pStyle w:val="Paragraphedeliste"/>
+        <w:rPr>
+          <w:lang w:val="fr-MA"/>
+        </w:rPr>
+      </w:pPr>
     </w:p>
     <w:p>
       <w:pPr>
@@ -613,6 +489,154 @@
           <w:bCs/>
           <w:lang w:val="fr-MA"/>
         </w:rPr>
+        <w:t>Espace Admin :</w:t>
+      </w:r>
+    </w:p>
+    <w:p>
+      <w:pPr>
+        <w:pStyle w:val="Paragraphedeliste"/>
+        <w:numPr>
+          <w:ilvl w:val="0"/>
+          <w:numId w:val="2"/>
+        </w:numPr>
+        <w:rPr>
+          <w:lang w:val="fr-MA"/>
+        </w:rPr>
+      </w:pPr>
+      <w:r>
+        <w:rPr>
+          <w:lang w:val="fr-MA"/>
+        </w:rPr>
+        <w:t>Navbar</w:t>
+      </w:r>
+    </w:p>
+    <w:p>
+      <w:pPr>
+        <w:pStyle w:val="Paragraphedeliste"/>
+        <w:numPr>
+          <w:ilvl w:val="0"/>
+          <w:numId w:val="2"/>
+        </w:numPr>
+        <w:rPr>
+          <w:lang w:val="fr-MA"/>
+        </w:rPr>
+      </w:pPr>
+      <w:r>
+        <w:rPr>
+          <w:lang w:val="fr-MA"/>
+        </w:rPr>
+        <w:t>Dashboard</w:t>
+      </w:r>
+    </w:p>
+    <w:p>
+      <w:pPr>
+        <w:pStyle w:val="Paragraphedeliste"/>
+        <w:numPr>
+          <w:ilvl w:val="0"/>
+          <w:numId w:val="2"/>
+        </w:numPr>
+        <w:rPr>
+          <w:lang w:val="fr-MA"/>
+        </w:rPr>
+      </w:pPr>
+      <w:r>
+        <w:rPr>
+          <w:lang w:val="fr-MA"/>
+        </w:rPr>
+        <w:t>Pages voitures :</w:t>
+      </w:r>
+    </w:p>
+    <w:p>
+      <w:pPr>
+        <w:pStyle w:val="Paragraphedeliste"/>
+        <w:numPr>
+          <w:ilvl w:val="0"/>
+          <w:numId w:val="3"/>
+        </w:numPr>
+        <w:rPr>
+          <w:lang w:val="fr-MA"/>
+        </w:rPr>
+      </w:pPr>
+      <w:r>
+        <w:rPr>
+          <w:lang w:val="fr-MA"/>
+        </w:rPr>
+        <w:t>Button et formulaire pour ajouter une voiture</w:t>
+      </w:r>
+    </w:p>
+    <w:p>
+      <w:pPr>
+        <w:pStyle w:val="Paragraphedeliste"/>
+        <w:numPr>
+          <w:ilvl w:val="0"/>
+          <w:numId w:val="3"/>
+        </w:numPr>
+        <w:rPr>
+          <w:lang w:val="fr-MA"/>
+        </w:rPr>
+      </w:pPr>
+      <w:r>
+        <w:rPr>
+          <w:lang w:val="fr-MA"/>
+        </w:rPr>
+        <w:t>Cards des voitures avec buttons : voir details, modifier,supprimer</w:t>
+      </w:r>
+    </w:p>
+    <w:p>
+      <w:pPr>
+        <w:pStyle w:val="Paragraphedeliste"/>
+        <w:numPr>
+          <w:ilvl w:val="0"/>
+          <w:numId w:val="2"/>
+        </w:numPr>
+        <w:rPr>
+          <w:lang w:val="fr-MA"/>
+        </w:rPr>
+      </w:pPr>
+      <w:r>
+        <w:rPr>
+          <w:lang w:val="fr-MA"/>
+        </w:rPr>
+        <w:t>Pages des demandes :</w:t>
+      </w:r>
+    </w:p>
+    <w:p>
+      <w:pPr>
+        <w:pStyle w:val="Paragraphedeliste"/>
+        <w:numPr>
+          <w:ilvl w:val="0"/>
+          <w:numId w:val="4"/>
+        </w:numPr>
+        <w:rPr>
+          <w:lang w:val="fr-MA"/>
+        </w:rPr>
+      </w:pPr>
+      <w:r>
+        <w:rPr>
+          <w:lang w:val="fr-MA"/>
+        </w:rPr>
+        <w:t>Afficher tous les demandes des clients avec buttons : voir details, accepter,refuser</w:t>
+      </w:r>
+    </w:p>
+    <w:p>
+      <w:pPr>
+        <w:pStyle w:val="Paragraphedeliste"/>
+        <w:numPr>
+          <w:ilvl w:val="0"/>
+          <w:numId w:val="1"/>
+        </w:numPr>
+        <w:rPr>
+          <w:b/>
+          <w:bCs/>
+          <w:lang w:val="fr-MA"/>
+        </w:rPr>
+      </w:pPr>
+      <w:r>
+        <w:rPr>
+          <w:b/>
+          <w:bCs/>
+          <w:lang w:val="fr-MA"/>
+        </w:rPr>
         <w:t>Espace Client :</w:t>
       </w:r>
     </w:p>
@@ -770,8 +794,6 @@
           <w:lang w:val="fr-MA"/>
         </w:rPr>
       </w:pPr>
-      <w:bookmarkStart w:id="0" w:name="_GoBack"/>
-      <w:bookmarkEnd w:id="0"/>
     </w:p>
     <w:sectPr>
       <w:pgSz w:w="15840" w:h="24480" w:code="3"/>
@@ -1242,39 +1264,12 @@
   </w:num>
   <w:num w:numId="2">
     <w:abstractNumId w:val="0"/>
-    <w:lvlOverride w:ilvl="0"/>
-    <w:lvlOverride w:ilvl="1"/>
-    <w:lvlOverride w:ilvl="2"/>
-    <w:lvlOverride w:ilvl="3"/>
-    <w:lvlOverride w:ilvl="4"/>
-    <w:lvlOverride w:ilvl="5"/>
-    <w:lvlOverride w:ilvl="6"/>
-    <w:lvlOverride w:ilvl="7"/>
-    <w:lvlOverride w:ilvl="8"/>
   </w:num>
   <w:num w:numId="3">
     <w:abstractNumId w:val="1"/>
-    <w:lvlOverride w:ilvl="0"/>
-    <w:lvlOverride w:ilvl="1"/>
-    <w:lvlOverride w:ilvl="2"/>
-    <w:lvlOverride w:ilvl="3"/>
-    <w:lvlOverride w:ilvl="4"/>
-    <w:lvlOverride w:ilvl="5"/>
-    <w:lvlOverride w:ilvl="6"/>
-    <w:lvlOverride w:ilvl="7"/>
-    <w:lvlOverride w:ilvl="8"/>
   </w:num>
   <w:num w:numId="4">
     <w:abstractNumId w:val="2"/>
-    <w:lvlOverride w:ilvl="0"/>
-    <w:lvlOverride w:ilvl="1"/>
-    <w:lvlOverride w:ilvl="2"/>
-    <w:lvlOverride w:ilvl="3"/>
-    <w:lvlOverride w:ilvl="4"/>
-    <w:lvlOverride w:ilvl="5"/>
-    <w:lvlOverride w:ilvl="6"/>
-    <w:lvlOverride w:ilvl="7"/>
-    <w:lvlOverride w:ilvl="8"/>
   </w:num>
 </w:numbering>
 </file>

</xml_diff>

<commit_message>
admin supprimer une voiture
</commit_message>
<xml_diff>
--- a/documents-resources/programme_suivant.docx
+++ b/documents-resources/programme_suivant.docx
@@ -858,6 +858,42 @@
           <w:lang w:val="fr-MA"/>
         </w:rPr>
         <w:t>Ajouter un script pour fetch les données</w:t>
+      </w:r>
+    </w:p>
+    <w:p>
+      <w:pPr>
+        <w:pStyle w:val="Paragraphedeliste"/>
+        <w:numPr>
+          <w:ilvl w:val="0"/>
+          <w:numId w:val="2"/>
+        </w:numPr>
+        <w:rPr>
+          <w:lang w:val="fr-MA"/>
+        </w:rPr>
+      </w:pPr>
+      <w:r>
+        <w:rPr>
+          <w:lang w:val="fr-MA"/>
+        </w:rPr>
+        <w:t>Message par email lors d’une nouvelle reservation</w:t>
+      </w:r>
+    </w:p>
+    <w:p>
+      <w:pPr>
+        <w:pStyle w:val="Paragraphedeliste"/>
+        <w:numPr>
+          <w:ilvl w:val="0"/>
+          <w:numId w:val="2"/>
+        </w:numPr>
+        <w:rPr>
+          <w:lang w:val="fr-MA"/>
+        </w:rPr>
+      </w:pPr>
+      <w:r>
+        <w:rPr>
+          <w:lang w:val="fr-MA"/>
+        </w:rPr>
+        <w:t>Spin avant le chargement de chaque données</w:t>
       </w:r>
       <w:bookmarkStart w:id="0" w:name="_GoBack"/>
       <w:bookmarkEnd w:id="0"/>

</xml_diff>

<commit_message>
correction de gestion des réservations
</commit_message>
<xml_diff>
--- a/documents-resources/programme_suivant.docx
+++ b/documents-resources/programme_suivant.docx
@@ -803,6 +803,24 @@
         <w:rPr>
           <w:lang w:val="fr-MA"/>
         </w:rPr>
+        <w:t>Cacher afficher le mot de passe</w:t>
+      </w:r>
+    </w:p>
+    <w:p>
+      <w:pPr>
+        <w:pStyle w:val="Paragraphedeliste"/>
+        <w:numPr>
+          <w:ilvl w:val="0"/>
+          <w:numId w:val="2"/>
+        </w:numPr>
+        <w:rPr>
+          <w:lang w:val="fr-MA"/>
+        </w:rPr>
+      </w:pPr>
+      <w:r>
+        <w:rPr>
+          <w:lang w:val="fr-MA"/>
+        </w:rPr>
         <w:t>Vérification de l’email lors de l’inscription</w:t>
       </w:r>
     </w:p>
@@ -839,7 +857,49 @@
         <w:rPr>
           <w:lang w:val="fr-MA"/>
         </w:rPr>
-        <w:t>Ajouter les restrictions sur l’access au page (public, admin, client)</w:t>
+        <w:t>Commentaires : like, et animation page accueil</w:t>
+      </w:r>
+      <w:r>
+        <w:rPr>
+          <w:lang w:val="fr-MA"/>
+        </w:rPr>
+        <w:t xml:space="preserve"> 4 par 4</w:t>
+      </w:r>
+    </w:p>
+    <w:p>
+      <w:pPr>
+        <w:pStyle w:val="Paragraphedeliste"/>
+        <w:numPr>
+          <w:ilvl w:val="0"/>
+          <w:numId w:val="2"/>
+        </w:numPr>
+        <w:rPr>
+          <w:lang w:val="fr-MA"/>
+        </w:rPr>
+      </w:pPr>
+      <w:r>
+        <w:rPr>
+          <w:lang w:val="fr-MA"/>
+        </w:rPr>
+        <w:t>Message par email lors d’une nouvelle reservation</w:t>
+      </w:r>
+    </w:p>
+    <w:p>
+      <w:pPr>
+        <w:pStyle w:val="Paragraphedeliste"/>
+        <w:numPr>
+          <w:ilvl w:val="0"/>
+          <w:numId w:val="2"/>
+        </w:numPr>
+        <w:rPr>
+          <w:lang w:val="fr-MA"/>
+        </w:rPr>
+      </w:pPr>
+      <w:r>
+        <w:rPr>
+          <w:lang w:val="fr-MA"/>
+        </w:rPr>
+        <w:t>Dashboard statistiques : client et admin</w:t>
       </w:r>
     </w:p>
     <w:p>
@@ -875,25 +935,25 @@
         <w:rPr>
           <w:lang w:val="fr-MA"/>
         </w:rPr>
-        <w:t>Message par email lors d’une nouvelle reservation</w:t>
-      </w:r>
-    </w:p>
-    <w:p>
-      <w:pPr>
-        <w:pStyle w:val="Paragraphedeliste"/>
-        <w:numPr>
-          <w:ilvl w:val="0"/>
-          <w:numId w:val="2"/>
-        </w:numPr>
-        <w:rPr>
-          <w:lang w:val="fr-MA"/>
-        </w:rPr>
-      </w:pPr>
-      <w:r>
-        <w:rPr>
-          <w:lang w:val="fr-MA"/>
-        </w:rPr>
         <w:t>Spin avant le chargement de chaque données</w:t>
+      </w:r>
+    </w:p>
+    <w:p>
+      <w:pPr>
+        <w:pStyle w:val="Paragraphedeliste"/>
+        <w:numPr>
+          <w:ilvl w:val="0"/>
+          <w:numId w:val="2"/>
+        </w:numPr>
+        <w:rPr>
+          <w:lang w:val="fr-MA"/>
+        </w:rPr>
+      </w:pPr>
+      <w:r>
+        <w:rPr>
+          <w:lang w:val="fr-MA"/>
+        </w:rPr>
+        <w:t>Réorganiser le code et l’optimiser</w:t>
       </w:r>
       <w:bookmarkStart w:id="0" w:name="_GoBack"/>
       <w:bookmarkEnd w:id="0"/>

</xml_diff>

<commit_message>
corriger filtre des voitures
</commit_message>
<xml_diff>
--- a/documents-resources/programme_suivant.docx
+++ b/documents-resources/programme_suivant.docx
@@ -39,7 +39,7 @@
         <w:rPr>
           <w:lang w:val="fr-MA"/>
         </w:rPr>
-        <w:t>Vérification de l’email lors de l’inscription</w:t>
+        <w:t>Message par email lors d’une nouvelle reservation &amp;&amp;</w:t>
       </w:r>
     </w:p>
     <w:p>
@@ -57,8 +57,10 @@
         <w:rPr>
           <w:lang w:val="fr-MA"/>
         </w:rPr>
-        <w:t>Mot de passe oublier</w:t>
+        <w:t>Message de contact &amp;&amp;</w:t>
       </w:r>
+      <w:bookmarkStart w:id="0" w:name="_GoBack"/>
+      <w:bookmarkEnd w:id="0"/>
     </w:p>
     <w:p>
       <w:pPr>
@@ -75,7 +77,13 @@
         <w:rPr>
           <w:lang w:val="fr-MA"/>
         </w:rPr>
-        <w:t>Message par email lors d’une nouvelle reservation</w:t>
+        <w:t>Vérification de l’email lors de l’inscription</w:t>
+      </w:r>
+      <w:r>
+        <w:rPr>
+          <w:lang w:val="fr-MA"/>
+        </w:rPr>
+        <w:t xml:space="preserve"> ##</w:t>
       </w:r>
     </w:p>
     <w:p>
@@ -93,7 +101,7 @@
         <w:rPr>
           <w:lang w:val="fr-MA"/>
         </w:rPr>
-        <w:t>Ajouter un script pour fetch les données</w:t>
+        <w:t>Mot de passe oublier</w:t>
       </w:r>
     </w:p>
     <w:p>
@@ -111,7 +119,7 @@
         <w:rPr>
           <w:lang w:val="fr-MA"/>
         </w:rPr>
-        <w:t>Spin avant le chargement de chaque données</w:t>
+        <w:t>Ajouter un script pour fetch les données</w:t>
       </w:r>
     </w:p>
     <w:p>
@@ -129,7 +137,7 @@
         <w:rPr>
           <w:lang w:val="fr-MA"/>
         </w:rPr>
-        <w:t>Réorganiser le code et l’optimiser</w:t>
+        <w:t>Spin avant le chargement de chaque données</w:t>
       </w:r>
     </w:p>
     <w:p>
@@ -147,10 +155,26 @@
         <w:rPr>
           <w:lang w:val="fr-MA"/>
         </w:rPr>
+        <w:t>Réorganiser le code et l’optimiser</w:t>
+      </w:r>
+    </w:p>
+    <w:p>
+      <w:pPr>
+        <w:pStyle w:val="Paragraphedeliste"/>
+        <w:numPr>
+          <w:ilvl w:val="0"/>
+          <w:numId w:val="2"/>
+        </w:numPr>
+        <w:rPr>
+          <w:lang w:val="fr-MA"/>
+        </w:rPr>
+      </w:pPr>
+      <w:r>
+        <w:rPr>
+          <w:lang w:val="fr-MA"/>
+        </w:rPr>
         <w:t>Ajouter des watchers sur les données</w:t>
       </w:r>
-      <w:bookmarkStart w:id="0" w:name="_GoBack"/>
-      <w:bookmarkEnd w:id="0"/>
     </w:p>
     <w:p>
       <w:pPr>

</xml_diff>